<commit_message>
Replace CV templates with clean placeholder versions (no real names)
</commit_message>
<xml_diff>
--- a/public/cv-templates/ats-classic.docx
+++ b/public/cv-templates/ats-classic.docx
@@ -16,7 +16,7 @@
           <w:sz w:val="52"/>
           <w:szCs w:val="52"/>
         </w:rPr>
-        <w:t xml:space="preserve">SARAH NAKATO MUGERWA</w:t>
+        <w:t xml:space="preserve">[YOUR FULL NAME]</w:t>
       </w:r>
     </w:p>
     <w:p>
@@ -44,13 +44,11 @@
       <w:r>
         <w:rPr>
           <w:rFonts w:ascii="Calibri" w:cs="Calibri" w:eastAsia="Calibri" w:hAnsi="Calibri"/>
-          <w:i w:val="false"/>
-          <w:iCs w:val="false"/>
           <w:color w:val="6B7280"/>
           <w:sz w:val="20"/>
           <w:szCs w:val="20"/>
         </w:rPr>
-        <w:t xml:space="preserve">📍 Kampala, Uganda  |  📞 +256 772 123 456  |  ✉ sarah.mugerwa@email.com  |  LinkedIn: linkedin.com/in/sarahnakato</w:t>
+        <w:t xml:space="preserve">📍 [City, Uganda]  |  📞 [+256 7XX XXX XXX]  |  ✉ [your.email@domain.com]  |  LinkedIn: [linkedin.com/in/yourprofile]</w:t>
       </w:r>
     </w:p>
     <w:tbl>
@@ -125,7 +123,7 @@
           <w:sz w:val="21"/>
           <w:szCs w:val="21"/>
         </w:rPr>
-        <w:t xml:space="preserve">Results-driven Programme Officer with 6+ years of experience designing and managing public health and community development programmes across Uganda and East Africa. Proven track record of securing and managing donor grants from USAID, UNICEF, and the Global Fund. Skilled in programme cycle management, M&amp;E frameworks, stakeholder engagement, and team leadership. Passionate about driving sustainable development outcomes for vulnerable communities.</w:t>
+        <w:t xml:space="preserve">Results-driven Programme Officer with [X]+ years of experience designing and managing public health and community development programmes across Uganda and East Africa. Proven track record of securing and managing donor grants from [Donor Names]. Skilled in programme cycle management, M&amp;E frameworks, stakeholder engagement, and team leadership. Passionate about driving sustainable development outcomes for vulnerable communities.</w:t>
       </w:r>
     </w:p>
     <w:p>
@@ -160,7 +158,7 @@
           <w:sz w:val="22"/>
           <w:szCs w:val="22"/>
         </w:rPr>
-        <w:t xml:space="preserve">Senior Programme Officer</w:t>
+        <w:t xml:space="preserve">[Job Title]</w:t>
       </w:r>
       <w:r>
         <w:rPr>
@@ -178,7 +176,7 @@
           <w:sz w:val="22"/>
           <w:szCs w:val="22"/>
         </w:rPr>
-        <w:t xml:space="preserve">Uganda Health Marketing Group (UHMG)</w:t>
+        <w:t xml:space="preserve">[Organisation Name]</w:t>
       </w:r>
     </w:p>
     <w:p>
@@ -188,13 +186,11 @@
       <w:r>
         <w:rPr>
           <w:rFonts w:ascii="Calibri" w:cs="Calibri" w:eastAsia="Calibri" w:hAnsi="Calibri"/>
-          <w:i w:val="false"/>
-          <w:iCs w:val="false"/>
           <w:color w:val="6B7280"/>
           <w:sz w:val="20"/>
           <w:szCs w:val="20"/>
         </w:rPr>
-        <w:t xml:space="preserve">March 2021 – Present  •  Kampala, Uganda</w:t>
+        <w:t xml:space="preserve">[Month Year] – Present  •  [Location]</w:t>
       </w:r>
     </w:p>
     <w:p>
@@ -212,7 +208,7 @@
           <w:sz w:val="21"/>
           <w:szCs w:val="21"/>
         </w:rPr>
-        <w:t xml:space="preserve">Lead implementation of a UGX 4.2 billion USAID-funded reproductive health programme serving 180,000+ beneficiaries across 12 districts.</w:t>
+        <w:t xml:space="preserve">Lead implementation of a [programme name] serving [X]+ beneficiaries across [X] districts.</w:t>
       </w:r>
     </w:p>
     <w:p>
@@ -230,7 +226,7 @@
           <w:sz w:val="21"/>
           <w:szCs w:val="21"/>
         </w:rPr>
-        <w:t xml:space="preserve">Coordinate a team of 14 field officers and 3 district coordinators, conducting monthly performance reviews and capacity building sessions.</w:t>
+        <w:t xml:space="preserve">Coordinate a team of [X] field officers and [X] district coordinators, conducting monthly performance reviews.</w:t>
       </w:r>
     </w:p>
     <w:p>
@@ -248,7 +244,7 @@
           <w:sz w:val="21"/>
           <w:szCs w:val="21"/>
         </w:rPr>
-        <w:t xml:space="preserve">Develop quarterly donor reports, ensuring 100% compliance with USAID PEPFAR reporting requirements and financial accountability standards.</w:t>
+        <w:t xml:space="preserve">Develop quarterly donor reports, ensuring 100% compliance with [Donor] reporting requirements.</w:t>
       </w:r>
     </w:p>
     <w:p>
@@ -266,7 +262,55 @@
           <w:sz w:val="21"/>
           <w:szCs w:val="21"/>
         </w:rPr>
-        <w:t xml:space="preserve">Established 47 community health clubs in Wakiso and Mukono districts, achieving a 34% increase in antenatal care attendance.</w:t>
+        <w:t xml:space="preserve">Manage programme budget of [USD/UGX X], maintaining less than [X]% variance against planned expenditure.</w:t>
+      </w:r>
+    </w:p>
+    <w:p>
+      <w:pPr>
+        <w:spacing w:after="40" w:before="160"/>
+      </w:pPr>
+      <w:r>
+        <w:rPr>
+          <w:rFonts w:ascii="Calibri" w:cs="Calibri" w:eastAsia="Calibri" w:hAnsi="Calibri"/>
+          <w:b/>
+          <w:bCs/>
+          <w:color w:val="0D1B2A"/>
+          <w:sz w:val="22"/>
+          <w:szCs w:val="22"/>
+        </w:rPr>
+        <w:t xml:space="preserve">[Previous Job Title]</w:t>
+      </w:r>
+      <w:r>
+        <w:rPr>
+          <w:rFonts w:ascii="Calibri" w:cs="Calibri" w:eastAsia="Calibri" w:hAnsi="Calibri"/>
+          <w:color w:val="6B7280"/>
+          <w:sz w:val="22"/>
+          <w:szCs w:val="22"/>
+        </w:rPr>
+        <w:t xml:space="preserve">  |  </w:t>
+      </w:r>
+      <w:r>
+        <w:rPr>
+          <w:rFonts w:ascii="Calibri" w:cs="Calibri" w:eastAsia="Calibri" w:hAnsi="Calibri"/>
+          <w:color w:val="00B8A9"/>
+          <w:sz w:val="22"/>
+          <w:szCs w:val="22"/>
+        </w:rPr>
+        <w:t xml:space="preserve">[Previous Organisation]</w:t>
+      </w:r>
+    </w:p>
+    <w:p>
+      <w:pPr>
+        <w:spacing w:after="60" w:before="0"/>
+      </w:pPr>
+      <w:r>
+        <w:rPr>
+          <w:rFonts w:ascii="Calibri" w:cs="Calibri" w:eastAsia="Calibri" w:hAnsi="Calibri"/>
+          <w:color w:val="6B7280"/>
+          <w:sz w:val="20"/>
+          <w:szCs w:val="20"/>
+        </w:rPr>
+        <w:t xml:space="preserve">[Month Year] – [Month Year]  •  [Location]</w:t>
       </w:r>
     </w:p>
     <w:p>
@@ -284,57 +328,7 @@
           <w:sz w:val="21"/>
           <w:szCs w:val="21"/>
         </w:rPr>
-        <w:t xml:space="preserve">Manage programme budget of USD 1.2 million, maintaining less than 2% variance against planned expenditure across all reporting periods.</w:t>
-      </w:r>
-    </w:p>
-    <w:p>
-      <w:pPr>
-        <w:spacing w:after="40" w:before="160"/>
-      </w:pPr>
-      <w:r>
-        <w:rPr>
-          <w:rFonts w:ascii="Calibri" w:cs="Calibri" w:eastAsia="Calibri" w:hAnsi="Calibri"/>
-          <w:b/>
-          <w:bCs/>
-          <w:color w:val="0D1B2A"/>
-          <w:sz w:val="22"/>
-          <w:szCs w:val="22"/>
-        </w:rPr>
-        <w:t xml:space="preserve">Programme Officer</w:t>
-      </w:r>
-      <w:r>
-        <w:rPr>
-          <w:rFonts w:ascii="Calibri" w:cs="Calibri" w:eastAsia="Calibri" w:hAnsi="Calibri"/>
-          <w:color w:val="6B7280"/>
-          <w:sz w:val="22"/>
-          <w:szCs w:val="22"/>
-        </w:rPr>
-        <w:t xml:space="preserve">  |  </w:t>
-      </w:r>
-      <w:r>
-        <w:rPr>
-          <w:rFonts w:ascii="Calibri" w:cs="Calibri" w:eastAsia="Calibri" w:hAnsi="Calibri"/>
-          <w:color w:val="00B8A9"/>
-          <w:sz w:val="22"/>
-          <w:szCs w:val="22"/>
-        </w:rPr>
-        <w:t xml:space="preserve">Marie Stopes Uganda</w:t>
-      </w:r>
-    </w:p>
-    <w:p>
-      <w:pPr>
-        <w:spacing w:after="60" w:before="0"/>
-      </w:pPr>
-      <w:r>
-        <w:rPr>
-          <w:rFonts w:ascii="Calibri" w:cs="Calibri" w:eastAsia="Calibri" w:hAnsi="Calibri"/>
-          <w:i w:val="false"/>
-          <w:iCs w:val="false"/>
-          <w:color w:val="6B7280"/>
-          <w:sz w:val="20"/>
-          <w:szCs w:val="20"/>
-        </w:rPr>
-        <w:t xml:space="preserve">June 2018 – February 2021  •  Kampala, Uganda</w:t>
+        <w:t xml:space="preserve">Supported design and rollout of [programme] reaching [X] beneficiaries in [Region], Uganda.</w:t>
       </w:r>
     </w:p>
     <w:p>
@@ -352,7 +346,7 @@
           <w:sz w:val="21"/>
           <w:szCs w:val="21"/>
         </w:rPr>
-        <w:t xml:space="preserve">Supported design and rollout of family planning outreach campaigns reaching 65,000 women of reproductive age in Northern Uganda.</w:t>
+        <w:t xml:space="preserve">Coordinated with district offices in [District 1], [District 2] to integrate services into routine delivery systems.</w:t>
       </w:r>
     </w:p>
     <w:p>
@@ -370,7 +364,7 @@
           <w:sz w:val="21"/>
           <w:szCs w:val="21"/>
         </w:rPr>
-        <w:t xml:space="preserve">Coordinated with district health offices in Gulu, Lira, and Oyam to integrate services into routine health delivery systems.</w:t>
+        <w:t xml:space="preserve">Prepared monthly progress reports and data summaries for submission to [Donor/Partner].</w:t>
       </w:r>
     </w:p>
     <w:p>
@@ -388,129 +382,7 @@
           <w:sz w:val="21"/>
           <w:szCs w:val="21"/>
         </w:rPr>
-        <w:t xml:space="preserve">Prepared monthly progress reports, success stories, and data summaries for submission to the UNFPA and DFID funding partners.</w:t>
-      </w:r>
-    </w:p>
-    <w:p>
-      <w:pPr>
-        <w:pStyle w:val="ListParagraph"/>
-        <w:numPr>
-          <w:ilvl w:val="0"/>
-          <w:numId w:val="2"/>
-        </w:numPr>
-        <w:spacing w:after="40" w:before="0"/>
-      </w:pPr>
-      <w:r>
-        <w:rPr>
-          <w:rFonts w:ascii="Calibri" w:cs="Calibri" w:eastAsia="Calibri" w:hAnsi="Calibri"/>
-          <w:sz w:val="21"/>
-          <w:szCs w:val="21"/>
-        </w:rPr>
-        <w:t xml:space="preserve">Trained 120 Village Health Teams (VHTs) on community mobilisation, referral pathways, and basic health education messaging.</w:t>
-      </w:r>
-    </w:p>
-    <w:p>
-      <w:pPr>
-        <w:spacing w:after="40" w:before="160"/>
-      </w:pPr>
-      <w:r>
-        <w:rPr>
-          <w:rFonts w:ascii="Calibri" w:cs="Calibri" w:eastAsia="Calibri" w:hAnsi="Calibri"/>
-          <w:b/>
-          <w:bCs/>
-          <w:color w:val="0D1B2A"/>
-          <w:sz w:val="22"/>
-          <w:szCs w:val="22"/>
-        </w:rPr>
-        <w:t xml:space="preserve">Programme Assistant</w:t>
-      </w:r>
-      <w:r>
-        <w:rPr>
-          <w:rFonts w:ascii="Calibri" w:cs="Calibri" w:eastAsia="Calibri" w:hAnsi="Calibri"/>
-          <w:color w:val="6B7280"/>
-          <w:sz w:val="22"/>
-          <w:szCs w:val="22"/>
-        </w:rPr>
-        <w:t xml:space="preserve">  |  </w:t>
-      </w:r>
-      <w:r>
-        <w:rPr>
-          <w:rFonts w:ascii="Calibri" w:cs="Calibri" w:eastAsia="Calibri" w:hAnsi="Calibri"/>
-          <w:color w:val="00B8A9"/>
-          <w:sz w:val="22"/>
-          <w:szCs w:val="22"/>
-        </w:rPr>
-        <w:t xml:space="preserve">CARE International Uganda</w:t>
-      </w:r>
-    </w:p>
-    <w:p>
-      <w:pPr>
-        <w:spacing w:after="60" w:before="0"/>
-      </w:pPr>
-      <w:r>
-        <w:rPr>
-          <w:rFonts w:ascii="Calibri" w:cs="Calibri" w:eastAsia="Calibri" w:hAnsi="Calibri"/>
-          <w:i w:val="false"/>
-          <w:iCs w:val="false"/>
-          <w:color w:val="6B7280"/>
-          <w:sz w:val="20"/>
-          <w:szCs w:val="20"/>
-        </w:rPr>
-        <w:t xml:space="preserve">January 2017 – May 2018  •  Kampala, Uganda</w:t>
-      </w:r>
-    </w:p>
-    <w:p>
-      <w:pPr>
-        <w:pStyle w:val="ListParagraph"/>
-        <w:numPr>
-          <w:ilvl w:val="0"/>
-          <w:numId w:val="2"/>
-        </w:numPr>
-        <w:spacing w:after="40" w:before="0"/>
-      </w:pPr>
-      <w:r>
-        <w:rPr>
-          <w:rFonts w:ascii="Calibri" w:cs="Calibri" w:eastAsia="Calibri" w:hAnsi="Calibri"/>
-          <w:sz w:val="21"/>
-          <w:szCs w:val="21"/>
-        </w:rPr>
-        <w:t xml:space="preserve">Provided administrative and logistical support for gender-based violence prevention programmes in refugee settlements in Adjumani and Arua.</w:t>
-      </w:r>
-    </w:p>
-    <w:p>
-      <w:pPr>
-        <w:pStyle w:val="ListParagraph"/>
-        <w:numPr>
-          <w:ilvl w:val="0"/>
-          <w:numId w:val="2"/>
-        </w:numPr>
-        <w:spacing w:after="40" w:before="0"/>
-      </w:pPr>
-      <w:r>
-        <w:rPr>
-          <w:rFonts w:ascii="Calibri" w:cs="Calibri" w:eastAsia="Calibri" w:hAnsi="Calibri"/>
-          <w:sz w:val="21"/>
-          <w:szCs w:val="21"/>
-        </w:rPr>
-        <w:t xml:space="preserve">Maintained programme databases, tracking over 8,500 beneficiary records with 98% data accuracy rating in routine audits.</w:t>
-      </w:r>
-    </w:p>
-    <w:p>
-      <w:pPr>
-        <w:pStyle w:val="ListParagraph"/>
-        <w:numPr>
-          <w:ilvl w:val="0"/>
-          <w:numId w:val="2"/>
-        </w:numPr>
-        <w:spacing w:after="40" w:before="0"/>
-      </w:pPr>
-      <w:r>
-        <w:rPr>
-          <w:rFonts w:ascii="Calibri" w:cs="Calibri" w:eastAsia="Calibri" w:hAnsi="Calibri"/>
-          <w:sz w:val="21"/>
-          <w:szCs w:val="21"/>
-        </w:rPr>
-        <w:t xml:space="preserve">Facilitated focus group discussions and key informant interviews for mid-term programme evaluations.</w:t>
+        <w:t xml:space="preserve">Trained [X] staff/volunteers on [topic], achieving [measurable outcome].</w:t>
       </w:r>
     </w:p>
     <w:p>
@@ -534,7 +406,7 @@
     </w:p>
     <w:p>
       <w:pPr>
-        <w:spacing w:after="60" w:before="120"/>
+        <w:spacing w:after="20" w:before="80"/>
       </w:pPr>
       <w:r>
         <w:rPr>
@@ -545,7 +417,7 @@
           <w:sz w:val="22"/>
           <w:szCs w:val="22"/>
         </w:rPr>
-        <w:t xml:space="preserve">Master of Public Health (MPH)</w:t>
+        <w:t xml:space="preserve">[Degree Name]</w:t>
       </w:r>
       <w:r>
         <w:rPr>
@@ -559,11 +431,13 @@
       <w:r>
         <w:rPr>
           <w:rFonts w:ascii="Calibri" w:cs="Calibri" w:eastAsia="Calibri" w:hAnsi="Calibri"/>
+          <w:b/>
+          <w:bCs/>
           <w:color w:val="00B8A9"/>
           <w:sz w:val="22"/>
           <w:szCs w:val="22"/>
         </w:rPr>
-        <w:t xml:space="preserve">Makerere University School of Public Health</w:t>
+        <w:t xml:space="preserve">[University Name]</w:t>
       </w:r>
       <w:r>
         <w:rPr>
@@ -572,8 +446,13 @@
           <w:sz w:val="20"/>
           <w:szCs w:val="20"/>
         </w:rPr>
-        <w:t xml:space="preserve">  (2019)</w:t>
-      </w:r>
+        <w:t xml:space="preserve">  ([Year])</w:t>
+      </w:r>
+    </w:p>
+    <w:p>
+      <w:pPr>
+        <w:spacing w:after="40" w:before="0"/>
+      </w:pPr>
       <w:r>
         <w:rPr>
           <w:rFonts w:ascii="Calibri" w:cs="Calibri" w:eastAsia="Calibri" w:hAnsi="Calibri"/>
@@ -581,13 +460,12 @@
           <w:sz w:val="20"/>
           <w:szCs w:val="20"/>
         </w:rPr>
-        <w:t xml:space="preserve">
-Specialisation: Epidemiology &amp; Biostatistics. Thesis: Community Health Worker Effectiveness in Rural Uganda.</w:t>
-      </w:r>
-    </w:p>
-    <w:p>
-      <w:pPr>
-        <w:spacing w:after="60" w:before="120"/>
+        <w:t xml:space="preserve">[Specialisation / Thesis title if applicable]</w:t>
+      </w:r>
+    </w:p>
+    <w:p>
+      <w:pPr>
+        <w:spacing w:after="20" w:before="60"/>
       </w:pPr>
       <w:r>
         <w:rPr>
@@ -598,7 +476,7 @@
           <w:sz w:val="22"/>
           <w:szCs w:val="22"/>
         </w:rPr>
-        <w:t xml:space="preserve">Bachelor of Environmental Health Science (Hons)</w:t>
+        <w:t xml:space="preserve">[Undergraduate Degree]</w:t>
       </w:r>
       <w:r>
         <w:rPr>
@@ -612,11 +490,13 @@
       <w:r>
         <w:rPr>
           <w:rFonts w:ascii="Calibri" w:cs="Calibri" w:eastAsia="Calibri" w:hAnsi="Calibri"/>
+          <w:b/>
+          <w:bCs/>
           <w:color w:val="00B8A9"/>
           <w:sz w:val="22"/>
           <w:szCs w:val="22"/>
         </w:rPr>
-        <w:t xml:space="preserve">Makerere University</w:t>
+        <w:t xml:space="preserve">[University Name]</w:t>
       </w:r>
       <w:r>
         <w:rPr>
@@ -625,17 +505,7 @@
           <w:sz w:val="20"/>
           <w:szCs w:val="20"/>
         </w:rPr>
-        <w:t xml:space="preserve">  (2016)</w:t>
-      </w:r>
-      <w:r>
-        <w:rPr>
-          <w:rFonts w:ascii="Calibri" w:cs="Calibri" w:eastAsia="Calibri" w:hAnsi="Calibri"/>
-          <w:color w:val="6B7280"/>
-          <w:sz w:val="20"/>
-          <w:szCs w:val="20"/>
-        </w:rPr>
-        <w:t xml:space="preserve">
-First Class Honours. Best Graduating Student Award — School of Public Health.</w:t>
+        <w:t xml:space="preserve">  ([Year])</w:t>
       </w:r>
     </w:p>
     <w:p>
@@ -697,7 +567,7 @@
                 <w:sz w:val="21"/>
                 <w:szCs w:val="21"/>
               </w:rPr>
-              <w:t xml:space="preserve">Programme Cycle Management</w:t>
+              <w:t xml:space="preserve"> Programme Cycle Management</w:t>
             </w:r>
           </w:p>
           <w:p>
@@ -714,7 +584,7 @@
                 <w:sz w:val="21"/>
                 <w:szCs w:val="21"/>
               </w:rPr>
-              <w:t xml:space="preserve">Monitoring, Evaluation &amp; Learning (MEL)</w:t>
+              <w:t xml:space="preserve"> Monitoring, Evaluation &amp; Learning (MEL)</w:t>
             </w:r>
           </w:p>
           <w:p>
@@ -731,7 +601,7 @@
                 <w:sz w:val="21"/>
                 <w:szCs w:val="21"/>
               </w:rPr>
-              <w:t xml:space="preserve">Donor Reporting (USAID, UNICEF, DFID)</w:t>
+              <w:t xml:space="preserve"> Donor Reporting (USAID, UNICEF, DFID)</w:t>
             </w:r>
           </w:p>
           <w:p>
@@ -748,7 +618,7 @@
                 <w:sz w:val="21"/>
                 <w:szCs w:val="21"/>
               </w:rPr>
-              <w:t xml:space="preserve">Budget Management &amp; Financial Reporting</w:t>
+              <w:t xml:space="preserve"> Budget Management &amp; Financial Reporting</w:t>
             </w:r>
           </w:p>
         </w:tc>
@@ -775,7 +645,7 @@
                 <w:sz w:val="21"/>
                 <w:szCs w:val="21"/>
               </w:rPr>
-              <w:t xml:space="preserve">Stakeholder &amp; Partnership Coordination</w:t>
+              <w:t xml:space="preserve"> Stakeholder &amp; Partnership Coordination</w:t>
             </w:r>
           </w:p>
           <w:p>
@@ -792,7 +662,7 @@
                 <w:sz w:val="21"/>
                 <w:szCs w:val="21"/>
               </w:rPr>
-              <w:t xml:space="preserve">Community Mobilisation &amp; Engagement</w:t>
+              <w:t xml:space="preserve"> Community Mobilisation &amp; Engagement</w:t>
             </w:r>
           </w:p>
           <w:p>
@@ -809,7 +679,7 @@
                 <w:sz w:val="21"/>
                 <w:szCs w:val="21"/>
               </w:rPr>
-              <w:t xml:space="preserve">Data Analysis: SPSS, KoBoToolbox, Excel</w:t>
+              <w:t xml:space="preserve"> Data Analysis: SPSS, KoBoToolbox, Excel</w:t>
             </w:r>
           </w:p>
           <w:p>
@@ -826,7 +696,7 @@
                 <w:sz w:val="21"/>
                 <w:szCs w:val="21"/>
               </w:rPr>
-              <w:t xml:space="preserve">Report Writing &amp; Proposal Development</w:t>
+              <w:t xml:space="preserve"> Report Writing &amp; Proposal Development</w:t>
             </w:r>
           </w:p>
         </w:tc>
@@ -866,54 +736,41 @@
     </w:p>
     <w:p>
       <w:pPr>
-        <w:spacing w:after="40" w:before="80"/>
-      </w:pPr>
-      <w:r>
-        <w:rPr>
-          <w:rFonts w:ascii="Calibri" w:cs="Calibri" w:eastAsia="Calibri" w:hAnsi="Calibri"/>
-          <w:sz w:val="21"/>
-          <w:szCs w:val="21"/>
-        </w:rPr>
-        <w:t xml:space="preserve">• Project Management for Development Professionals (PMD Pro) — PM4NGOs, 2022</w:t>
-      </w:r>
-    </w:p>
-    <w:p>
-      <w:pPr>
-        <w:spacing w:after="40" w:before="0"/>
-      </w:pPr>
-      <w:r>
-        <w:rPr>
-          <w:rFonts w:ascii="Calibri" w:cs="Calibri" w:eastAsia="Calibri" w:hAnsi="Calibri"/>
-          <w:sz w:val="21"/>
-          <w:szCs w:val="21"/>
-        </w:rPr>
-        <w:t xml:space="preserve">• Results-Based Management (RBM) — UNDP Uganda, 2021</w:t>
-      </w:r>
-    </w:p>
-    <w:p>
-      <w:pPr>
-        <w:spacing w:after="40" w:before="0"/>
-      </w:pPr>
-      <w:r>
-        <w:rPr>
-          <w:rFonts w:ascii="Calibri" w:cs="Calibri" w:eastAsia="Calibri" w:hAnsi="Calibri"/>
-          <w:sz w:val="21"/>
-          <w:szCs w:val="21"/>
-        </w:rPr>
-        <w:t xml:space="preserve">• Certificate in Monitoring &amp; Evaluation — Uganda Evaluation Association, 2020</w:t>
-      </w:r>
-    </w:p>
-    <w:p>
-      <w:pPr>
-        <w:spacing w:after="40" w:before="0"/>
-      </w:pPr>
-      <w:r>
-        <w:rPr>
-          <w:rFonts w:ascii="Calibri" w:cs="Calibri" w:eastAsia="Calibri" w:hAnsi="Calibri"/>
-          <w:sz w:val="21"/>
-          <w:szCs w:val="21"/>
-        </w:rPr>
-        <w:t xml:space="preserve">• USAID Collaborating, Learning and Adapting (CLA) Workshop — USAID Uganda, 2022</w:t>
+        <w:spacing w:after="20" w:before="40"/>
+      </w:pPr>
+      <w:r>
+        <w:rPr>
+          <w:rFonts w:ascii="Calibri" w:cs="Calibri" w:eastAsia="Calibri" w:hAnsi="Calibri"/>
+          <w:sz w:val="21"/>
+          <w:szCs w:val="21"/>
+        </w:rPr>
+        <w:t xml:space="preserve">• [Certification Name] — [Issuing Body], [Year]</w:t>
+      </w:r>
+    </w:p>
+    <w:p>
+      <w:pPr>
+        <w:spacing w:after="20" w:before="40"/>
+      </w:pPr>
+      <w:r>
+        <w:rPr>
+          <w:rFonts w:ascii="Calibri" w:cs="Calibri" w:eastAsia="Calibri" w:hAnsi="Calibri"/>
+          <w:sz w:val="21"/>
+          <w:szCs w:val="21"/>
+        </w:rPr>
+        <w:t xml:space="preserve">• [Certification Name] — [Issuing Body], [Year]</w:t>
+      </w:r>
+    </w:p>
+    <w:p>
+      <w:pPr>
+        <w:spacing w:after="20" w:before="40"/>
+      </w:pPr>
+      <w:r>
+        <w:rPr>
+          <w:rFonts w:ascii="Calibri" w:cs="Calibri" w:eastAsia="Calibri" w:hAnsi="Calibri"/>
+          <w:sz w:val="21"/>
+          <w:szCs w:val="21"/>
+        </w:rPr>
+        <w:t xml:space="preserve">• [Certification Name] — [Issuing Body], [Year]</w:t>
       </w:r>
     </w:p>
     <w:p>
@@ -961,20 +818,20 @@
           <w:sz w:val="22"/>
           <w:szCs w:val="22"/>
         </w:rPr>
-        <w:t xml:space="preserve">Dr. James Okuonzi</w:t>
-      </w:r>
-      <w:r>
-        <w:rPr>
-          <w:rFonts w:ascii="Calibri" w:cs="Calibri" w:eastAsia="Calibri" w:hAnsi="Calibri"/>
-          <w:sz w:val="21"/>
-          <w:szCs w:val="21"/>
-        </w:rPr>
-        <w:t xml:space="preserve"> — Country Director, Marie Stopes Uganda | james.okuonzi@mariestopes.or.ug | +256 414 000 111</w:t>
-      </w:r>
-    </w:p>
-    <w:p>
-      <w:pPr>
-        <w:spacing w:after="20" w:before="40"/>
+        <w:t xml:space="preserve">[Referee Full Name]</w:t>
+      </w:r>
+      <w:r>
+        <w:rPr>
+          <w:rFonts w:ascii="Calibri" w:cs="Calibri" w:eastAsia="Calibri" w:hAnsi="Calibri"/>
+          <w:sz w:val="21"/>
+          <w:szCs w:val="21"/>
+        </w:rPr>
+        <w:t xml:space="preserve"> — [Title], [Organisation] | [email@org.com] | [+256 XXX XXX XXX]</w:t>
+      </w:r>
+    </w:p>
+    <w:p>
+      <w:pPr>
+        <w:spacing w:before="40"/>
       </w:pPr>
       <w:r>
         <w:rPr>
@@ -985,15 +842,15 @@
           <w:sz w:val="22"/>
           <w:szCs w:val="22"/>
         </w:rPr>
-        <w:t xml:space="preserve">Ms. Patricia Nambi</w:t>
-      </w:r>
-      <w:r>
-        <w:rPr>
-          <w:rFonts w:ascii="Calibri" w:cs="Calibri" w:eastAsia="Calibri" w:hAnsi="Calibri"/>
-          <w:sz w:val="21"/>
-          <w:szCs w:val="21"/>
-        </w:rPr>
-        <w:t xml:space="preserve"> — M&amp;E Advisor, UHMG | patricia.nambi@uhmg.org | +256 772 987 654</w:t>
+        <w:t xml:space="preserve">[Referee Full Name]</w:t>
+      </w:r>
+      <w:r>
+        <w:rPr>
+          <w:rFonts w:ascii="Calibri" w:cs="Calibri" w:eastAsia="Calibri" w:hAnsi="Calibri"/>
+          <w:sz w:val="21"/>
+          <w:szCs w:val="21"/>
+        </w:rPr>
+        <w:t xml:space="preserve"> — [Title], [Organisation] | [email@org.com] | [+256 XXX XXX XXX]</w:t>
       </w:r>
     </w:p>
     <w:sectPr>

</xml_diff>